<commit_message>
Enlarge grey legend/annotation text in R10 layout figure inside 修复.docx only (legend 16->20, exit note 14->17, U labels 17->19, top labels 18/17->20); other docx/md/shared PNG untouched per user request
</commit_message>
<xml_diff>
--- a/08_组员资料/成员4_Part4_交付/ID-Coo_报告提交框架_EN_R9完成_R10四页版_修复.docx
+++ b/08_组员资料/成员4_Part4_交付/ID-Coo_报告提交框架_EN_R9完成_R10四页版_修复.docx
@@ -457,7 +457,15 @@
               <w:spacing w:after="0" w:line="240" w:lineRule="auto"/>
             </w:pPr>
             <w:r>
-              <w:t>by the School;</w:t>
+              <w:t xml:space="preserve">by the </w:t>
+            </w:r>
+            <w:proofErr w:type="gramStart"/>
+            <w:r>
+              <w:t>School</w:t>
+            </w:r>
+            <w:proofErr w:type="gramEnd"/>
+            <w:r>
+              <w:t>;</w:t>
             </w:r>
           </w:p>
           <w:p>
@@ -615,7 +623,15 @@
               <w:t>all text quoted</w:t>
             </w:r>
             <w:r>
-              <w:t xml:space="preserve"> from books, journals and online sources, in accordance with the School’s accepted referencing style(s).</w:t>
+              <w:t xml:space="preserve"> from books, journals and online sources, in accordance with the </w:t>
+            </w:r>
+            <w:proofErr w:type="gramStart"/>
+            <w:r>
+              <w:t>School’s</w:t>
+            </w:r>
+            <w:proofErr w:type="gramEnd"/>
+            <w:r>
+              <w:t xml:space="preserve"> accepted referencing style(s).</w:t>
             </w:r>
           </w:p>
         </w:tc>
@@ -970,7 +986,15 @@
           </w:tcPr>
           <w:p>
             <w:r>
-              <w:t>In addition, I understand that any false claim in respect of this work will result in conduct action in accordance with University regulations</w:t>
+              <w:t xml:space="preserve">In addition, I understand that any false claim in respect of this work will result in conduct action in accordance with </w:t>
+            </w:r>
+            <w:proofErr w:type="gramStart"/>
+            <w:r>
+              <w:t>University</w:t>
+            </w:r>
+            <w:proofErr w:type="gramEnd"/>
+            <w:r>
+              <w:t xml:space="preserve"> regulations</w:t>
             </w:r>
           </w:p>
         </w:tc>
@@ -1108,7 +1132,15 @@
               <w:t xml:space="preserve">, </w:t>
             </w:r>
             <w:r>
-              <w:t>except where indicated by referencing, and that I have followed the good academic practices noted above</w:t>
+              <w:t xml:space="preserve">except </w:t>
+            </w:r>
+            <w:proofErr w:type="gramStart"/>
+            <w:r>
+              <w:t>where</w:t>
+            </w:r>
+            <w:proofErr w:type="gramEnd"/>
+            <w:r>
+              <w:t xml:space="preserve"> indicated by referencing, and that I have followed the good academic practices noted above</w:t>
             </w:r>
           </w:p>
           <w:p>
@@ -1515,7 +1547,15 @@
             </w:r>
             <w:proofErr w:type="spellEnd"/>
             <w:r>
-              <w:t xml:space="preserve"> the identification affects farm operation and individual cows on a daily basis as well as the LIS system and milk buyer information.</w:t>
+              <w:t xml:space="preserve"> the identification affects farm operation and individual cows </w:t>
+            </w:r>
+            <w:proofErr w:type="gramStart"/>
+            <w:r>
+              <w:t>on a daily basis</w:t>
+            </w:r>
+            <w:proofErr w:type="gramEnd"/>
+            <w:r>
+              <w:t xml:space="preserve"> as well as the LIS system and milk buyer information.</w:t>
             </w:r>
           </w:p>
           <w:p>
@@ -2116,12 +2156,36 @@
           </w:p>
           <w:p>
             <w:r>
-              <w:t>The target customers are dairy farms in Northern England with an existing handling race, electronic tags and a genuine verification burden. Neither AHDB’s 6,850 Great Britain dairy producers [13] nor Defra’s 1.849 million UK dairy cattle [14] states the Northern England farm count directly.</w:t>
+              <w:t xml:space="preserve">The target customers are dairy farms in Northern England with an existing handling race, electronic tags and a genuine verification burden. Neither AHDB’s 6,850 Great Britain dairy producers [13] nor Defra’s 1.849 million UK dairy cattle [14] </w:t>
+            </w:r>
+            <w:proofErr w:type="gramStart"/>
+            <w:r>
+              <w:t>states</w:t>
+            </w:r>
+            <w:proofErr w:type="gramEnd"/>
+            <w:r>
+              <w:t xml:space="preserve"> the Northern England farm count directly.</w:t>
             </w:r>
           </w:p>
           <w:p>
             <w:r>
-              <w:t xml:space="preserve">This report therefore estimates it from Defra's 2024 regional profiles [15]: total farms (agricultural area ÷ average farm size, Table 1.1) multiplied by the dairy share of holdings (Figure 1.7) gives ≈1,240 (North West), ≈406 (Yorkshire &amp; the Humber) and ≈63 (North East), </w:t>
+              <w:t>This report therefore estimates it from Defra's 2024 regional profiles [15]: total farms (agricultural area ÷ average farm size, Table 1.1) multiplied by the dairy share of holdings (Figure 1.7) gives ≈1,240 (</w:t>
+            </w:r>
+            <w:proofErr w:type="gramStart"/>
+            <w:r>
+              <w:t>North West</w:t>
+            </w:r>
+            <w:proofErr w:type="gramEnd"/>
+            <w:r>
+              <w:t>), ≈406 (Yorkshire &amp; the Humber) and ≈63 (</w:t>
+            </w:r>
+            <w:proofErr w:type="gramStart"/>
+            <w:r>
+              <w:t>North East</w:t>
+            </w:r>
+            <w:proofErr w:type="gramEnd"/>
+            <w:r>
+              <w:t xml:space="preserve">), </w:t>
             </w:r>
             <w:proofErr w:type="spellStart"/>
             <w:r>
@@ -2268,7 +2332,15 @@
           </w:p>
           <w:p>
             <w:r>
-              <w:t xml:space="preserve">One implementation adjustment remains: per-head isolation may bottleneck throughput and first-time safe separation is unvalidated, so version one uses manual confirmation of single-animal entry, with automation only after validation. This constrains </w:t>
+              <w:t xml:space="preserve">One implementation adjustment remains: per-head isolation may bottleneck </w:t>
+            </w:r>
+            <w:proofErr w:type="gramStart"/>
+            <w:r>
+              <w:t>throughput</w:t>
+            </w:r>
+            <w:proofErr w:type="gramEnd"/>
+            <w:r>
+              <w:t xml:space="preserve"> and first-time safe separation is unvalidated, so version one uses manual confirmation of single-animal entry, with automation only after validation. This constrains </w:t>
             </w:r>
             <w:proofErr w:type="spellStart"/>
             <w:r>
@@ -2396,7 +2468,19 @@
               <w:t>:</w:t>
             </w:r>
             <w:r>
-              <w:t xml:space="preserve"> The system must link each passage to the correct cow when a valid electronic identifier is available. A wrong identity can corrupt treatment and herd records, making reliable attribution essential to the problem defined in Section 2.</w:t>
+              <w:t xml:space="preserve"> The system must link each passage to the correct cow when a valid electronic identifier is available. A wrong identity can corrupt treatment and herd records, making </w:t>
+            </w:r>
+            <w:r>
+              <w:t xml:space="preserve">a </w:t>
+            </w:r>
+            <w:r>
+              <w:t xml:space="preserve">reliable attribution </w:t>
+            </w:r>
+            <w:r>
+              <w:t xml:space="preserve">is </w:t>
+            </w:r>
+            <w:r>
+              <w:t>essential to the problem defined in Section 2.</w:t>
             </w:r>
           </w:p>
           <w:p>
@@ -2407,7 +2491,7 @@
               <w:t>:</w:t>
             </w:r>
             <w:r>
-              <w:t xml:space="preserve"> The system must never guess an identity. Where an identifier cannot be read or confirmed, the passage must be held as unconfirmed and passed to staff for review, pausing intake if that review cannot be completed safely. Tags can be lost or unreadable [3], [6]; a guess would repeat the very record error this system exists to remove.</w:t>
+              <w:t xml:space="preserve"> The system must leave unconfirmed identity unresolved and make the case available for safe staff review, pausing intake if review cannot continue. Tags can be lost or unreadable [3], [6]; a guessed identity would recreate the original record error.</w:t>
             </w:r>
           </w:p>
           <w:p>
@@ -2418,7 +2502,15 @@
               <w:t>:</w:t>
             </w:r>
             <w:r>
-              <w:t xml:space="preserve"> The system must not record cattle passing together or closely following as one confirmed animal. Otherwise a neighbouring identifier could be attributed to the wrong cow, undermining the identity assurance required in Section 8.</w:t>
+              <w:t xml:space="preserve"> The system must not record cattle passing together or closely following as one confirmed animal. </w:t>
+            </w:r>
+            <w:proofErr w:type="gramStart"/>
+            <w:r>
+              <w:t>Otherwise</w:t>
+            </w:r>
+            <w:proofErr w:type="gramEnd"/>
+            <w:r>
+              <w:t xml:space="preserve"> a neighbouring identifier could be attributed to the wrong cow, undermining the identity assurance required in Section 8.</w:t>
             </w:r>
           </w:p>
           <w:p>
@@ -2440,7 +2532,15 @@
               <w:t>:</w:t>
             </w:r>
             <w:r>
-              <w:t xml:space="preserve"> The system must confirm the exit actually taken and record each passage as one complete, truthful event. A late reading or an incorrect route must not leave an apparently complete but false event record.</w:t>
+              <w:t xml:space="preserve"> The system must confirm the exit </w:t>
+            </w:r>
+            <w:proofErr w:type="gramStart"/>
+            <w:r>
+              <w:t>actually taken</w:t>
+            </w:r>
+            <w:proofErr w:type="gramEnd"/>
+            <w:r>
+              <w:t xml:space="preserve"> and record each passage as one complete, truthful event. A late reading or an incorrect route must not leave an apparently complete but false event record.</w:t>
             </w:r>
           </w:p>
           <w:p>
@@ -2451,7 +2551,13 @@
               <w:t>:</w:t>
             </w:r>
             <w:r>
-              <w:t xml:space="preserve"> The service must continue essential identity checks and preserve passage and exception records during network outages. Farm handling cannot depend on continuous connectivity, and lost records would prevent later review.</w:t>
+              <w:t xml:space="preserve"> The service must continue essential identity checks and preserve passage and exception records during network outages. Farm handling cannot depend on continuous connectivity</w:t>
+            </w:r>
+            <w:r>
+              <w:t xml:space="preserve">, and </w:t>
+            </w:r>
+            <w:r>
+              <w:t>lost records would prevent later review.</w:t>
             </w:r>
           </w:p>
           <w:p>
@@ -2473,7 +2579,16 @@
               <w:t xml:space="preserve">: </w:t>
             </w:r>
             <w:r>
-              <w:t xml:space="preserve">he service must process 200 cattle within 90 minutes in the pilot, including repeated reads and reviews, without excessive queuing. Otherwise the checks would </w:t>
+              <w:t>T</w:t>
+            </w:r>
+            <w:r>
+              <w:t>he service must process 200 cattle within 90 minutes in the pilot, including repeated reads and reviews, without excessive queuing. Otherwise</w:t>
+            </w:r>
+            <w:r>
+              <w:t>,</w:t>
+            </w:r>
+            <w:r>
+              <w:t xml:space="preserve"> the checks would </w:t>
             </w:r>
             <w:r>
               <w:lastRenderedPageBreak/>
@@ -2555,7 +2670,13 @@
           </w:p>
           <w:p>
             <w:r>
-              <w:t>Version 1 has one buffer and one detection section. More upstream sections would add waiting space, not speed to the read-and-divert cycle, while adding gates and faults. Adjustable alleys about 526–800 mm wide, with 8 ft and 10 ft modules, indicate a structural envelope [16], [17]. A backing stop may help with reversal but cannot replace the separating gate.</w:t>
+              <w:t xml:space="preserve">Version 1 has one buffer and one detection section. More upstream sections would add waiting space, not speed to the read-and-divert cycle, while adding gates and faults. Adjustable alleys </w:t>
+            </w:r>
+            <w:r>
+              <w:t xml:space="preserve">are </w:t>
+            </w:r>
+            <w:r>
+              <w:t>about 526–800 mm wide, with 8 ft and 10 ft modules, indicate a structural envelope [16], [17]. A backing stop may help with reversal but cannot replace the separating gate.</w:t>
             </w:r>
           </w:p>
           <w:p>
@@ -2565,12 +2686,20 @@
           </w:p>
           <w:p>
             <w:r>
-              <w:t>The race requires non-slip drainage, no sharp projections, guarded tracks and hinges, safe head and leg clearances, and continuous exit boundaries [20]. Staff operate from outside; head restraint is optional. (UR4, UR8, UR9)</w:t>
+              <w:t xml:space="preserve">The race requires non-slip drainage, no sharp projections, guarded tracks and hinges, safe head and leg clearances, and continuous exit boundaries [20]. Staff operate from outside; head restraint is optional. </w:t>
             </w:r>
           </w:p>
           <w:p>
             <w:r>
-              <w:t>The review pen temporarily holds cows for manual identity checks; it is not for disease isolation. It needs an anti-return entrance, separate handling exit and outside operating space. Gate H closes only after the cow passes. A full pen or blocked branch stops intake.</w:t>
+              <w:t xml:space="preserve">The review pen temporarily holds cows for manual identity checks; it is not for disease isolation. It needs an anti-return entrance, separate handling </w:t>
+            </w:r>
+            <w:proofErr w:type="gramStart"/>
+            <w:r>
+              <w:t>exit</w:t>
+            </w:r>
+            <w:proofErr w:type="gramEnd"/>
+            <w:r>
+              <w:t xml:space="preserve"> and outside operating space. Gate H closes only after the cow passes. A full pen or blocked branch stops intake.</w:t>
             </w:r>
           </w:p>
           <w:p>
@@ -2581,6 +2710,9 @@
               <w:br/>
             </w:r>
             <w:r>
+              <w:rPr>
+                <w:noProof/>
+              </w:rPr>
               <w:lastRenderedPageBreak/>
               <w:drawing>
                 <wp:inline distT="0" distB="0" distL="0" distR="0" wp14:anchorId="1FBE1744" wp14:editId="5A8F5701">
@@ -2630,7 +2762,15 @@
           </w:p>
           <w:p>
             <w:r>
-              <w:t>An LF RFID reader scans LF EID tags where fitted using ISO 11784/11785, HDX and FDX-B. Cattle without an LF EID tag follow manual identity verification or an alternative workflow; an absent read alone does not diagnose tag damage [1]. Tru-Test XRP2/XRP2i is a functional reference; the final reader and antenna position outside B's head-and-ear zone depend on the site survey [4], [21].</w:t>
+              <w:t xml:space="preserve">An LF RFID reader scans LF EID tags </w:t>
+            </w:r>
+            <w:proofErr w:type="gramStart"/>
+            <w:r>
+              <w:t>where</w:t>
+            </w:r>
+            <w:proofErr w:type="gramEnd"/>
+            <w:r>
+              <w:t xml:space="preserve"> fitted using ISO 11784/11785, HDX and FDX-B. Cattle without an LF EID tag follow manual identity verification or an alternative workflow; an absent read alone does not diagnose tag damage [1]. Tru-Test XRP2/XRP2i is a functional reference; the final reader and antenna position outside B's head-and-ear zone depend on the site survey [4], [21].</w:t>
             </w:r>
           </w:p>
           <w:p>
@@ -2671,6 +2811,9 @@
           </w:p>
           <w:p>
             <w:r>
+              <w:rPr>
+                <w:noProof/>
+              </w:rPr>
               <w:drawing>
                 <wp:inline distT="0" distB="0" distL="0" distR="0" wp14:anchorId="4809B042" wp14:editId="36BBA739">
                   <wp:extent cx="5353403" cy="3273624"/>
@@ -2768,6 +2911,7 @@
               <w:t xml:space="preserve">Version 1 stores records locally and exports them for audit; direct LIS access is not assumed. If specifications and authorisation become available, an adapter will separate internal passages from reportable movements, validate fields, retain </w:t>
             </w:r>
             <w:r>
+              <w:lastRenderedPageBreak/>
               <w:t>submissions and receipts, prevent duplicates, and reconcile after outages [1], [8], [25].</w:t>
             </w:r>
           </w:p>
@@ -2793,7 +2937,15 @@
           </w:p>
           <w:p>
             <w:r>
-              <w:t>Trials report confirmed-read accuracy against a provisional ≥99.5% target and coverage separately, plus wrong diversions, exceptions, actual versus planned exits, takeovers and net labour time. Repeated passages by one herd are not independent animals; zero observed errors is not zero risk. Safe separation, read attribution and release precede economic validation. (UR1–UR10)</w:t>
+              <w:t xml:space="preserve">Trials report confirmed-read accuracy against a provisional ≥99.5% target and coverage separately, plus wrong diversions, exceptions, actual versus planned exits, takeovers and net labour time. Repeated passages by one herd are not independent animals; zero observed errors </w:t>
+            </w:r>
+            <w:proofErr w:type="gramStart"/>
+            <w:r>
+              <w:t>is</w:t>
+            </w:r>
+            <w:proofErr w:type="gramEnd"/>
+            <w:r>
+              <w:t xml:space="preserve"> not zero risk. Safe separation, read attribution and release precede economic validation. (UR1–UR10)</w:t>
             </w:r>
           </w:p>
         </w:tc>
@@ -3143,7 +3295,21 @@
         <w:rPr>
           <w:sz w:val="18"/>
         </w:rPr>
-        <w:t>[12] Department for Environment, Food and Rural Affairs, “Changes to bovine identification, registration and movement in England: Summary of responses and government response,” GOV.UK, n.d. [Online]. Available: https://www.gov.uk/government/consultations/changes-to-bovine-identification-registration-and-movement-in-england/outcome/summary-of-responses-and-government-response. Accessed: Oct. 15, 2026.</w:t>
+        <w:t xml:space="preserve">[12] Department for Environment, Food and Rural Affairs, “Changes to bovine identification, registration and movement in England: Summary of responses and government </w:t>
+      </w:r>
+      <w:proofErr w:type="gramStart"/>
+      <w:r>
+        <w:rPr>
+          <w:sz w:val="18"/>
+        </w:rPr>
+        <w:t>response</w:t>
+      </w:r>
+      <w:proofErr w:type="gramEnd"/>
+      <w:r>
+        <w:rPr>
+          <w:sz w:val="18"/>
+        </w:rPr>
+        <w:t>,” GOV.UK, n.d. [Online]. Available: https://www.gov.uk/government/consultations/changes-to-bovine-identification-registration-and-movement-in-england/outcome/summary-of-responses-and-government-response. Accessed: Oct. 15, 2026.</w:t>
       </w:r>
     </w:p>
     <w:p>
@@ -3169,7 +3335,21 @@
         <w:rPr>
           <w:sz w:val="18"/>
         </w:rPr>
-        <w:t>[14] Department for Environment, Food and Rural Affairs, “Livestock populations in the United Kingdom at 1 June 2025,” GOV.UK, 2025. [Online]. Available: https://www.gov.uk/government/statistics/livestock-populations-in-the-united-kingdom/livestock-populations-in-the-united-kingdom-at-1-june-2025. Accessed: Oct. 15, 2026.</w:t>
+        <w:t xml:space="preserve">[14] Department for Environment, Food and Rural Affairs, “Livestock populations in the United Kingdom </w:t>
+      </w:r>
+      <w:proofErr w:type="gramStart"/>
+      <w:r>
+        <w:rPr>
+          <w:sz w:val="18"/>
+        </w:rPr>
+        <w:t>at</w:t>
+      </w:r>
+      <w:proofErr w:type="gramEnd"/>
+      <w:r>
+        <w:rPr>
+          <w:sz w:val="18"/>
+        </w:rPr>
+        <w:t xml:space="preserve"> 1 June 2025,” GOV.UK, 2025. [Online]. Available: https://www.gov.uk/government/statistics/livestock-populations-in-the-united-kingdom/livestock-populations-in-the-united-kingdom-at-1-june-2025. Accessed: Oct. 15, 2026.</w:t>
       </w:r>
     </w:p>
     <w:p>
@@ -3237,7 +3417,8 @@
         <w:rPr>
           <w:sz w:val="18"/>
         </w:rPr>
-        <w:t xml:space="preserve">[19] J. O. L. Cerqueira, J. P. P. Araújo, P. S. Vaz, J. Cantalapiedra, I. Blanco-Penedo, and J. J. R. Niza-Ribeiro, “Relationship between zoometric measurements in Holstein-Friesian cow and cubicle size in dairy farms,” International Journal of Morphology, vol. 31, no. 1, pp. 55–63, 2013, doi: 10.4067/S0717-95022013000100008.</w:t>
+        <w:lastRenderedPageBreak/>
+        <w:t>[19] J. O. L. Cerqueira, J. P. P. Araújo, P. S. Vaz, J. Cantalapiedra, I. Blanco-Penedo, and J. J. R. Niza-Ribeiro, “Relationship between zoometric measurements in Holstein-Friesian cow and cubicle size in dairy farms,” International Journal of Morphology, vol. 31, no. 1, pp. 55–63, 2013, doi: 10.4067/S0717-95022013000100008.</w:t>
       </w:r>
     </w:p>
     <w:p>
@@ -3253,7 +3434,7 @@
         <w:rPr>
           <w:sz w:val="18"/>
         </w:rPr>
-        <w:t xml:space="preserve">[20] Department for Environment, Food and Rural Affairs, “Code of recommendations for the welfare of livestock: Cattle,” GOV.UK, Jan. 25, 2024. [Online]. Available: https://www.gov.uk/government/publications/code-of-recommendations-for-the-welfare-of-livestock-cattle/code-of-recommendations-for-the-welfare-of-livestock-cattle. Accessed: Oct. 15, 2026.</w:t>
+        <w:t>[20] Department for Environment, Food and Rural Affairs, “Code of recommendations for the welfare of livestock: Cattle,” GOV.UK, Jan. 25, 2024. [Online]. Available: https://www.gov.uk/government/publications/code-of-recommendations-for-the-welfare-of-livestock-cattle/code-of-recommendations-for-the-welfare-of-livestock-cattle. Accessed: Oct. 15, 2026.</w:t>
       </w:r>
     </w:p>
     <w:p>
@@ -3269,7 +3450,7 @@
         <w:rPr>
           <w:sz w:val="18"/>
         </w:rPr>
-        <w:t xml:space="preserve">[21] Tru-Test Datamars, “XRP2 panel reader and antenna,” n.d. [Online]. Available: https://us.tru-test.com/products/eid/xrp2-panel-reader-and-antennas. Accessed: Oct. 15, 2026.</w:t>
+        <w:t>[21] Tru-Test Datamars, “XRP2 panel reader and antenna,” n.d. [Online]. Available: https://us.tru-test.com/products/eid/xrp2-panel-reader-and-antennas. Accessed: Oct. 15, 2026.</w:t>
       </w:r>
     </w:p>
     <w:p>
@@ -3285,7 +3466,7 @@
         <w:rPr>
           <w:sz w:val="18"/>
         </w:rPr>
-        <w:t xml:space="preserve">[22] Banner Engineering, “Ultrasonic sensors 101: Answers to your frequently asked questions,” n.d. [Online]. Available: https://www.bannerengineering.com/sg/en/company/expert-insights/ultrasonic-sensors-101.html. Accessed: Oct. 15, 2026.</w:t>
+        <w:t>[22] Banner Engineering, “Ultrasonic sensors 101: Answers to your frequently asked questions,” n.d. [Online]. Available: https://www.bannerengineering.com/sg/en/company/expert-insights/ultrasonic-sensors-101.html. Accessed: Oct. 15, 2026.</w:t>
       </w:r>
     </w:p>
     <w:p>

</xml_diff>